<commit_message>
Simplify to DOCX-only output, remove PDF generation
- Remove HTML-based PDF rendering pipeline (extractTemplateInfo, compressImageToDataUrl, renderPdfFromHtml)
- Remove html2canvas and jsPDF CDN dependencies
- Remove render-container div and related CSS
- Remove output format UI and unused output-options CSS
- Single DOCX output per attendee, pixel-perfect from template
</commit_message>
<xml_diff>
--- a/Template Test/BICSI CERT - Enterprise Template.docx
+++ b/Template Test/BICSI CERT - Enterprise Template.docx
@@ -706,43 +706,55 @@
                       </wps:spPr>
                       <wps:txbx>
                         <w:txbxContent>
-                          <w:sdt>
-                            <w:sdtPr>
+                          <w:p>
+                            <w:pPr>
+                              <w:rPr>
+                                <w:rFonts w:ascii="Open Sans Light" w:hAnsi="Open Sans Light" w:cs="Open Sans Light"/>
+                              </w:rPr>
+                            </w:pPr>
+                            <w:r>
                               <w:rPr>
                                 <w:rStyle w:val="HeaderChar"/>
                               </w:rPr>
-                              <w:alias w:val="IssueDate"/>
-                              <w:tag w:val="IssueDate"/>
-                              <w:id w:val="-1907372868"/>
-                              <w:date>
-                                <w:dateFormat w:val="MMMM d, yyyy"/>
-                                <w:lid w:val="en-US"/>
-                                <w:storeMappedDataAs w:val="dateTime"/>
-                                <w:calendar w:val="gregorian"/>
-                              </w:date>
-                            </w:sdtPr>
-                            <w:sdtEndPr>
-                              <w:rPr>
-                                <w:rStyle w:val="DefaultParagraphFont"/>
-                                <w:rFonts w:ascii="Open Sans Light" w:hAnsi="Open Sans Light"/>
-                              </w:rPr>
-                            </w:sdtEndPr>
-                            <w:sdtContent>
-                              <w:p>
-                                <w:pPr>
-                                  <w:rPr>
-                                    <w:rFonts w:ascii="Open Sans Light" w:hAnsi="Open Sans Light" w:cs="Open Sans Light"/>
-                                  </w:rPr>
-                                </w:pPr>
+                              <w:t>[</w:t>
+                            </w:r>
+                            <w:sdt>
+                              <w:sdtPr>
+                                <w:rPr>
+                                  <w:rStyle w:val="HeaderChar"/>
+                                </w:rPr>
+                                <w:alias w:val="IssueDate"/>
+                                <w:tag w:val="IssueDate"/>
+                                <w:id w:val="-1907372868"/>
+                                <w:date>
+                                  <w:dateFormat w:val="MMMM d, yyyy"/>
+                                  <w:lid w:val="en-US"/>
+                                  <w:storeMappedDataAs w:val="dateTime"/>
+                                  <w:calendar w:val="gregorian"/>
+                                </w:date>
+                              </w:sdtPr>
+                              <w:sdtEndPr>
+                                <w:rPr>
+                                  <w:rStyle w:val="DefaultParagraphFont"/>
+                                  <w:rFonts w:ascii="Open Sans Light" w:hAnsi="Open Sans Light"/>
+                                </w:rPr>
+                              </w:sdtEndPr>
+                              <w:sdtContent>
                                 <w:r>
                                   <w:rPr>
                                     <w:rStyle w:val="HeaderChar"/>
                                   </w:rPr>
                                   <w:t>Date</w:t>
                                 </w:r>
-                              </w:p>
-                            </w:sdtContent>
-                          </w:sdt>
+                              </w:sdtContent>
+                            </w:sdt>
+                            <w:r>
+                              <w:rPr>
+                                <w:rFonts w:ascii="Open Sans Light" w:hAnsi="Open Sans Light"/>
+                              </w:rPr>
+                              <w:t>]</w:t>
+                            </w:r>
+                          </w:p>
                         </w:txbxContent>
                       </wps:txbx>
                       <wps:bodyPr rot="0" vert="horz" wrap="square" lIns="91440" tIns="45720" rIns="91440" bIns="45720" anchor="t" anchorCtr="0" upright="1">
@@ -762,46 +774,62 @@
           </mc:Choice>
           <mc:Fallback>
             <w:pict>
-              <v:shape w14:anchorId="0918C613" id="_x0000_s1030" type="#_x0000_t202" style="position:absolute;margin-left:-11.25pt;margin-top:457.6pt;width:151.5pt;height:21pt;z-index:251699712;visibility:visible;mso-wrap-style:square;mso-width-percent:0;mso-height-percent:0;mso-wrap-distance-left:9pt;mso-wrap-distance-top:3.6pt;mso-wrap-distance-right:9pt;mso-wrap-distance-bottom:3.6pt;mso-position-horizontal:absolute;mso-position-horizontal-relative:margin;mso-position-vertical:absolute;mso-position-vertical-relative:text;mso-width-percent:0;mso-height-percent:0;mso-width-relative:margin;mso-height-relative:margin;v-text-anchor:top" o:gfxdata="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" filled="f" stroked="f">
+              <v:shapetype w14:anchorId="0918C613" id="_x0000_t202" coordsize="21600,21600" o:spt="202" path="m,l,21600r21600,l21600,xe">
+                <v:stroke joinstyle="miter"/>
+                <v:path gradientshapeok="t" o:connecttype="rect"/>
+              </v:shapetype>
+              <v:shape id="_x0000_s1030" type="#_x0000_t202" style="position:absolute;margin-left:-11.25pt;margin-top:457.6pt;width:151.5pt;height:21pt;z-index:251699712;visibility:visible;mso-wrap-style:square;mso-width-percent:0;mso-height-percent:0;mso-wrap-distance-left:9pt;mso-wrap-distance-top:3.6pt;mso-wrap-distance-right:9pt;mso-wrap-distance-bottom:3.6pt;mso-position-horizontal:absolute;mso-position-horizontal-relative:margin;mso-position-vertical:absolute;mso-position-vertical-relative:text;mso-width-percent:0;mso-height-percent:0;mso-width-relative:margin;mso-height-relative:margin;v-text-anchor:top" o:gfxdata="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" filled="f" stroked="f">
                 <v:textbox>
                   <w:txbxContent>
-                    <w:sdt>
-                      <w:sdtPr>
+                    <w:p>
+                      <w:pPr>
+                        <w:rPr>
+                          <w:rFonts w:ascii="Open Sans Light" w:hAnsi="Open Sans Light" w:cs="Open Sans Light"/>
+                        </w:rPr>
+                      </w:pPr>
+                      <w:r>
                         <w:rPr>
                           <w:rStyle w:val="HeaderChar"/>
                         </w:rPr>
-                        <w:alias w:val="IssueDate"/>
-                        <w:tag w:val="IssueDate"/>
-                        <w:id w:val="-1907372868"/>
-                        <w:date>
-                          <w:dateFormat w:val="MMMM d, yyyy"/>
-                          <w:lid w:val="en-US"/>
-                          <w:storeMappedDataAs w:val="dateTime"/>
-                          <w:calendar w:val="gregorian"/>
-                        </w:date>
-                      </w:sdtPr>
-                      <w:sdtEndPr>
-                        <w:rPr>
-                          <w:rStyle w:val="DefaultParagraphFont"/>
-                          <w:rFonts w:ascii="Open Sans Light" w:hAnsi="Open Sans Light"/>
-                        </w:rPr>
-                      </w:sdtEndPr>
-                      <w:sdtContent>
-                        <w:p>
-                          <w:pPr>
-                            <w:rPr>
-                              <w:rFonts w:ascii="Open Sans Light" w:hAnsi="Open Sans Light" w:cs="Open Sans Light"/>
-                            </w:rPr>
-                          </w:pPr>
+                        <w:t>[</w:t>
+                      </w:r>
+                      <w:sdt>
+                        <w:sdtPr>
+                          <w:rPr>
+                            <w:rStyle w:val="HeaderChar"/>
+                          </w:rPr>
+                          <w:alias w:val="IssueDate"/>
+                          <w:tag w:val="IssueDate"/>
+                          <w:id w:val="-1907372868"/>
+                          <w:date>
+                            <w:dateFormat w:val="MMMM d, yyyy"/>
+                            <w:lid w:val="en-US"/>
+                            <w:storeMappedDataAs w:val="dateTime"/>
+                            <w:calendar w:val="gregorian"/>
+                          </w:date>
+                        </w:sdtPr>
+                        <w:sdtEndPr>
+                          <w:rPr>
+                            <w:rStyle w:val="DefaultParagraphFont"/>
+                            <w:rFonts w:ascii="Open Sans Light" w:hAnsi="Open Sans Light"/>
+                          </w:rPr>
+                        </w:sdtEndPr>
+                        <w:sdtContent>
                           <w:r>
                             <w:rPr>
                               <w:rStyle w:val="HeaderChar"/>
                             </w:rPr>
                             <w:t>Date</w:t>
                           </w:r>
-                        </w:p>
-                      </w:sdtContent>
-                    </w:sdt>
+                        </w:sdtContent>
+                      </w:sdt>
+                      <w:r>
+                        <w:rPr>
+                          <w:rFonts w:ascii="Open Sans Light" w:hAnsi="Open Sans Light"/>
+                        </w:rPr>
+                        <w:t>]</w:t>
+                      </w:r>
+                    </w:p>
                   </w:txbxContent>
                 </v:textbox>
                 <w10:wrap type="square" anchorx="margin"/>
@@ -1383,7 +1411,23 @@
                                     <w:rFonts w:cs="Open Sans SemiBold"/>
                                     <w:szCs w:val="48"/>
                                   </w:rPr>
+                                  <w:t>[</w:t>
+                                </w:r>
+                                <w:r>
+                                  <w:rPr>
+                                    <w:rStyle w:val="FirstNameChar"/>
+                                    <w:rFonts w:cs="Open Sans SemiBold"/>
+                                    <w:szCs w:val="48"/>
+                                  </w:rPr>
                                   <w:t>Name</w:t>
+                                </w:r>
+                                <w:r>
+                                  <w:rPr>
+                                    <w:rStyle w:val="FirstNameChar"/>
+                                    <w:rFonts w:cs="Open Sans SemiBold"/>
+                                    <w:szCs w:val="48"/>
+                                  </w:rPr>
+                                  <w:t>]</w:t>
                                 </w:r>
                               </w:p>
                             </w:sdtContent>
@@ -1446,7 +1490,23 @@
                               <w:rFonts w:cs="Open Sans SemiBold"/>
                               <w:szCs w:val="48"/>
                             </w:rPr>
+                            <w:t>[</w:t>
+                          </w:r>
+                          <w:r>
+                            <w:rPr>
+                              <w:rStyle w:val="FirstNameChar"/>
+                              <w:rFonts w:cs="Open Sans SemiBold"/>
+                              <w:szCs w:val="48"/>
+                            </w:rPr>
                             <w:t>Name</w:t>
+                          </w:r>
+                          <w:r>
+                            <w:rPr>
+                              <w:rStyle w:val="FirstNameChar"/>
+                              <w:rFonts w:cs="Open Sans SemiBold"/>
+                              <w:szCs w:val="48"/>
+                            </w:rPr>
+                            <w:t>]</w:t>
                           </w:r>
                         </w:p>
                       </w:sdtContent>
@@ -2580,7 +2640,9 @@
     <w:rsid w:val="001264BB"/>
     <w:rsid w:val="001D102A"/>
     <w:rsid w:val="0022473B"/>
+    <w:rsid w:val="002A0B1E"/>
     <w:rsid w:val="005120F2"/>
+    <w:rsid w:val="00690E00"/>
     <w:rsid w:val="008310F9"/>
     <w:rsid w:val="00873CAB"/>
     <w:rsid w:val="00957F0C"/>
@@ -3359,6 +3421,25 @@
 </file>
 
 <file path=customXml/item1.xml><?xml version="1.0" encoding="utf-8"?>
+<b:Sources xmlns:b="http://schemas.openxmlformats.org/officeDocument/2006/bibliography" xmlns="http://schemas.openxmlformats.org/officeDocument/2006/bibliography" SelectedStyle="\APASixthEditionOfficeOnline.xsl" StyleName="APA" Version="6"/>
+</file>
+
+<file path=customXml/item2.xml><?xml version="1.0" encoding="utf-8"?>
+<?mso-contentType ?>
+<FormTemplates xmlns="http://schemas.microsoft.com/sharepoint/v3/contenttype/forms">
+  <Display>DocumentLibraryForm</Display>
+  <Edit>DocumentLibraryForm</Edit>
+  <New>DocumentLibraryForm</New>
+</FormTemplates>
+</file>
+
+<file path=customXml/item3.xml><?xml version="1.0" encoding="utf-8"?>
+<p:properties xmlns:p="http://schemas.microsoft.com/office/2006/metadata/properties" xmlns:xsi="http://www.w3.org/2001/XMLSchema-instance" xmlns:pc="http://schemas.microsoft.com/office/infopath/2007/PartnerControls">
+  <documentManagement/>
+</p:properties>
+</file>
+
+<file path=customXml/item4.xml><?xml version="1.0" encoding="utf-8"?>
 <ct:contentTypeSchema xmlns:ct="http://schemas.microsoft.com/office/2006/metadata/contentType" xmlns:ma="http://schemas.microsoft.com/office/2006/metadata/properties/metaAttributes" ct:_="" ma:_="" ma:contentTypeName="Document" ma:contentTypeID="0x0101005A537CB35B465943A6B02EFF7411B7BD" ma:contentTypeVersion="6" ma:contentTypeDescription="Create a new document." ma:contentTypeScope="" ma:versionID="526e7fc245fc5aba3d82f1743bb3a702">
   <xsd:schema xmlns:xsd="http://www.w3.org/2001/XMLSchema" xmlns:xs="http://www.w3.org/2001/XMLSchema" xmlns:p="http://schemas.microsoft.com/office/2006/metadata/properties" xmlns:ns2="6df47f18-a894-4f36-86b5-68f76b696f2c" targetNamespace="http://schemas.microsoft.com/office/2006/metadata/properties" ma:root="true" ma:fieldsID="e91b858f83c97fdf0489a9e03b3d7285" ns2:_="">
     <xsd:import namespace="6df47f18-a894-4f36-86b5-68f76b696f2c"/>
@@ -3516,26 +3597,32 @@
 </ct:contentTypeSchema>
 </file>
 
-<file path=customXml/item2.xml><?xml version="1.0" encoding="utf-8"?>
-<p:properties xmlns:p="http://schemas.microsoft.com/office/2006/metadata/properties" xmlns:xsi="http://www.w3.org/2001/XMLSchema-instance" xmlns:pc="http://schemas.microsoft.com/office/infopath/2007/PartnerControls">
-  <documentManagement/>
-</p:properties>
+<file path=customXml/itemProps1.xml><?xml version="1.0" encoding="utf-8"?>
+<ds:datastoreItem xmlns:ds="http://schemas.openxmlformats.org/officeDocument/2006/customXml" ds:itemID="{B2D8AF85-7BF6-4F0D-927B-C04C0B37ADA6}">
+  <ds:schemaRefs>
+    <ds:schemaRef ds:uri="http://schemas.openxmlformats.org/officeDocument/2006/bibliography"/>
+  </ds:schemaRefs>
+</ds:datastoreItem>
 </file>
 
-<file path=customXml/item3.xml><?xml version="1.0" encoding="utf-8"?>
-<?mso-contentType ?>
-<FormTemplates xmlns="http://schemas.microsoft.com/sharepoint/v3/contenttype/forms">
-  <Display>DocumentLibraryForm</Display>
-  <Edit>DocumentLibraryForm</Edit>
-  <New>DocumentLibraryForm</New>
-</FormTemplates>
+<file path=customXml/itemProps2.xml><?xml version="1.0" encoding="utf-8"?>
+<ds:datastoreItem xmlns:ds="http://schemas.openxmlformats.org/officeDocument/2006/customXml" ds:itemID="{C2123F3D-8CF8-4B4A-9EF5-79CC3AA7EE07}">
+  <ds:schemaRefs>
+    <ds:schemaRef ds:uri="http://schemas.microsoft.com/sharepoint/v3/contenttype/forms"/>
+  </ds:schemaRefs>
+</ds:datastoreItem>
 </file>
 
-<file path=customXml/item4.xml><?xml version="1.0" encoding="utf-8"?>
-<b:Sources xmlns:b="http://schemas.openxmlformats.org/officeDocument/2006/bibliography" xmlns="http://schemas.openxmlformats.org/officeDocument/2006/bibliography" SelectedStyle="\APASixthEditionOfficeOnline.xsl" StyleName="APA" Version="6"/>
+<file path=customXml/itemProps3.xml><?xml version="1.0" encoding="utf-8"?>
+<ds:datastoreItem xmlns:ds="http://schemas.openxmlformats.org/officeDocument/2006/customXml" ds:itemID="{8DA8751F-736F-46F4-AA9C-872C813F8E0E}">
+  <ds:schemaRefs>
+    <ds:schemaRef ds:uri="http://schemas.microsoft.com/office/2006/metadata/properties"/>
+    <ds:schemaRef ds:uri="http://schemas.microsoft.com/office/infopath/2007/PartnerControls"/>
+  </ds:schemaRefs>
+</ds:datastoreItem>
 </file>
 
-<file path=customXml/itemProps1.xml><?xml version="1.0" encoding="utf-8"?>
+<file path=customXml/itemProps4.xml><?xml version="1.0" encoding="utf-8"?>
 <ds:datastoreItem xmlns:ds="http://schemas.openxmlformats.org/officeDocument/2006/customXml" ds:itemID="{7824B5B7-F573-4067-AE55-0EEEFF0CF002}">
   <ds:schemaRefs>
     <ds:schemaRef ds:uri="http://schemas.microsoft.com/office/2006/metadata/contentType"/>
@@ -3551,29 +3638,4 @@
     <ds:schemaRef ds:uri="http://schemas.microsoft.com/internal/obd"/>
   </ds:schemaRefs>
 </ds:datastoreItem>
-</file>
-
-<file path=customXml/itemProps2.xml><?xml version="1.0" encoding="utf-8"?>
-<ds:datastoreItem xmlns:ds="http://schemas.openxmlformats.org/officeDocument/2006/customXml" ds:itemID="{8DA8751F-736F-46F4-AA9C-872C813F8E0E}">
-  <ds:schemaRefs>
-    <ds:schemaRef ds:uri="http://schemas.microsoft.com/office/2006/metadata/properties"/>
-    <ds:schemaRef ds:uri="http://schemas.microsoft.com/office/infopath/2007/PartnerControls"/>
-  </ds:schemaRefs>
-</ds:datastoreItem>
-</file>
-
-<file path=customXml/itemProps3.xml><?xml version="1.0" encoding="utf-8"?>
-<ds:datastoreItem xmlns:ds="http://schemas.openxmlformats.org/officeDocument/2006/customXml" ds:itemID="{C2123F3D-8CF8-4B4A-9EF5-79CC3AA7EE07}">
-  <ds:schemaRefs>
-    <ds:schemaRef ds:uri="http://schemas.microsoft.com/sharepoint/v3/contenttype/forms"/>
-  </ds:schemaRefs>
-</ds:datastoreItem>
-</file>
-
-<file path=customXml/itemProps4.xml><?xml version="1.0" encoding="utf-8"?>
-<ds:datastoreItem xmlns:ds="http://schemas.openxmlformats.org/officeDocument/2006/customXml" ds:itemID="{B2D8AF85-7BF6-4F0D-927B-C04C0B37ADA6}">
-  <ds:schemaRefs>
-    <ds:schemaRef ds:uri="http://schemas.openxmlformats.org/officeDocument/2006/bibliography"/>
-  </ds:schemaRefs>
-</ds:datastoreItem>
 </file>
</xml_diff>